<commit_message>
Update production manuals after final hardening
</commit_message>
<xml_diff>
--- a/docs/manuales/01_Manual_General_Villas_Julie.docx
+++ b/docs/manuales/01_Manual_General_Villas_Julie.docx
@@ -88,25 +88,9 @@
               <w:spacing w:after="60"/>
             </w:pPr>
             <w:r>
-              <w:rPr>
-                <w:rFonts w:ascii="Calibri" w:hAnsi="Calibri"/>
-                <w:b/>
-                <w:i w:val="0"/>
-                <w:color w:val="1F4D78"/>
-                <w:sz w:val="22"/>
-              </w:rPr>
               <w:t>Base documental</w:t>
               <w:br/>
-            </w:r>
-            <w:r>
-              <w:rPr>
-                <w:rFonts w:ascii="Calibri" w:hAnsi="Calibri"/>
-                <w:b w:val="0"/>
-                <w:i w:val="0"/>
-                <w:color w:val="000000"/>
-                <w:sz w:val="21"/>
-              </w:rPr>
-              <w:t>Manual construido a partir del código fuente real del backend, el panel administrativo y los flujos oficiales de WhatsApp. Lo no verificable se marca expresamente como Pendiente de verificar.</w:t>
+              <w:t>Manual actualizado contra el código, el panel y la producción operativa al 27 de agosto de 2026. Los datos comerciales que aún debe proporcionar el propietario se identifican expresamente.</w:t>
             </w:r>
           </w:p>
         </w:tc>
@@ -764,16 +748,8 @@
             <w:vAlign w:val="center"/>
           </w:tcPr>
           <w:p>
-            <w:r/>
             <w:r>
-              <w:rPr>
-                <w:rFonts w:ascii="Calibri" w:hAnsi="Calibri"/>
-                <w:b w:val="0"/>
-                <w:i w:val="0"/>
-                <w:color w:val="000000"/>
-                <w:sz w:val="19"/>
-              </w:rPr>
-              <w:t>Previsto para administración superior; hoy no está aislado consistentemente</w:t>
+              <w:t>Administración superior protegida por rol; conserva al menos un superadministrador activo.</w:t>
             </w:r>
           </w:p>
         </w:tc>
@@ -1762,16 +1738,8 @@
             <w:vAlign w:val="center"/>
           </w:tcPr>
           <w:p>
-            <w:r/>
             <w:r>
-              <w:rPr>
-                <w:rFonts w:ascii="Calibri" w:hAnsi="Calibri"/>
-                <w:b w:val="0"/>
-                <w:i w:val="0"/>
-                <w:color w:val="000000"/>
-                <w:sz w:val="17"/>
-              </w:rPr>
-              <w:t>Muestra hasta 10 reservas y totales derivados de ese conjunto.</w:t>
+              <w:t>Muestra métricas globales, reservas, valor confirmado, huéspedes y alertas operativas.</w:t>
             </w:r>
           </w:p>
         </w:tc>
@@ -1781,16 +1749,8 @@
             <w:vAlign w:val="center"/>
           </w:tcPr>
           <w:p>
-            <w:r/>
             <w:r>
-              <w:rPr>
-                <w:rFonts w:ascii="Calibri" w:hAnsi="Calibri"/>
-                <w:b w:val="0"/>
-                <w:i w:val="0"/>
-                <w:color w:val="000000"/>
-                <w:sz w:val="17"/>
-              </w:rPr>
-              <w:t>No es un reporte financiero integral.</w:t>
+              <w:t>Los totales se calculan desde la base de datos; use Reportes para análisis y exportación.</w:t>
             </w:r>
           </w:p>
         </w:tc>
@@ -1958,16 +1918,8 @@
             <w:vAlign w:val="center"/>
           </w:tcPr>
           <w:p>
-            <w:r/>
             <w:r>
-              <w:rPr>
-                <w:rFonts w:ascii="Calibri" w:hAnsi="Calibri"/>
-                <w:b w:val="0"/>
-                <w:i w:val="0"/>
-                <w:color w:val="000000"/>
-                <w:sz w:val="17"/>
-              </w:rPr>
-              <w:t>Los roles visibles no coinciden totalmente con el backend.</w:t>
+              <w:t>El módulo operativo mantiene huéspedes; las cuentas del panel se administran por separado.</w:t>
             </w:r>
           </w:p>
         </w:tc>
@@ -2175,16 +2127,8 @@
             <w:vAlign w:val="center"/>
           </w:tcPr>
           <w:p>
-            <w:r/>
             <w:r>
-              <w:rPr>
-                <w:rFonts w:ascii="Calibri" w:hAnsi="Calibri"/>
-                <w:b w:val="0"/>
-                <w:i w:val="0"/>
-                <w:color w:val="000000"/>
-                <w:sz w:val="17"/>
-              </w:rPr>
-              <w:t>Crear y editar cuentas del panel, contraseña y estado.</w:t>
+              <w:t>Crear y editar cuentas del panel, contraseña, estado y rol.</w:t>
             </w:r>
           </w:p>
         </w:tc>
@@ -2194,16 +2138,8 @@
             <w:vAlign w:val="center"/>
           </w:tcPr>
           <w:p>
-            <w:r/>
             <w:r>
-              <w:rPr>
-                <w:rFonts w:ascii="Calibri" w:hAnsi="Calibri"/>
-                <w:b w:val="0"/>
-                <w:i w:val="0"/>
-                <w:color w:val="000000"/>
-                <w:sz w:val="17"/>
-              </w:rPr>
-              <w:t>Diferencia de nombre super_admin/superadmin.</w:t>
+              <w:t>Solo el superadministrador puede gestionar cuentas administrativas.</w:t>
             </w:r>
           </w:p>
         </w:tc>
@@ -2293,16 +2229,8 @@
             <w:vAlign w:val="center"/>
           </w:tcPr>
           <w:p>
-            <w:r/>
             <w:r>
-              <w:rPr>
-                <w:rFonts w:ascii="Calibri" w:hAnsi="Calibri"/>
-                <w:b w:val="0"/>
-                <w:i w:val="0"/>
-                <w:color w:val="000000"/>
-                <w:sz w:val="17"/>
-              </w:rPr>
-              <w:t>Pantalla visible.</w:t>
+              <w:t>Consultas globales de ingresos, ocupación, huéspedes y tendencias con exportación a Excel.</w:t>
             </w:r>
           </w:p>
         </w:tc>
@@ -2312,16 +2240,8 @@
             <w:vAlign w:val="center"/>
           </w:tcPr>
           <w:p>
-            <w:r/>
             <w:r>
-              <w:rPr>
-                <w:rFonts w:ascii="Calibri" w:hAnsi="Calibri"/>
-                <w:b w:val="0"/>
-                <w:i w:val="0"/>
-                <w:color w:val="000000"/>
-                <w:sz w:val="17"/>
-              </w:rPr>
-              <w:t>Funcionalidad declarada en desarrollo.</w:t>
+              <w:t>Operativo con datos reales de la base de datos.</w:t>
             </w:r>
           </w:p>
         </w:tc>
@@ -2491,14 +2411,7 @@
         <w:ind w:left="540" w:hanging="271"/>
       </w:pPr>
       <w:r>
-        <w:rPr>
-          <w:rFonts w:ascii="Calibri" w:hAnsi="Calibri"/>
-          <w:b w:val="0"/>
-          <w:i w:val="0"/>
-          <w:color w:val="000000"/>
-          <w:sz w:val="22"/>
-        </w:rPr>
-        <w:t>La ventana de pago es configurable en servidor y se limita entre 1 y 168 horas; el valor operativo debe confirmarse con el propietario.</w:t>
+        <w:t>El anticipo es del 50 % y debe pagarse dentro de las 24 horas posteriores a la autorización. Entrada: 2:00 p. m.; salida: 11:00 a. m. No hay reembolsos. La oficina opera de 8:00 a. m. a 4:00 p. m. y el canal de asistencia está disponible 24/7.</w:t>
       </w:r>
     </w:p>
     <w:p>
@@ -2709,16 +2622,8 @@
             <w:vAlign w:val="center"/>
           </w:tcPr>
           <w:p>
-            <w:r/>
             <w:r>
-              <w:rPr>
-                <w:rFonts w:ascii="Calibri" w:hAnsi="Calibri"/>
-                <w:b w:val="0"/>
-                <w:i w:val="0"/>
-                <w:color w:val="000000"/>
-                <w:sz w:val="18"/>
-              </w:rPr>
-              <w:t>La decisión puede quedar guardada con notification_status=failed. Se requiere revisión operativa; no existe una bandeja visible de reintentos.</w:t>
+              <w:t>El aviso queda en una cola persistente y se reintenta automáticamente. El superadministrador puede revisarlo y reintentarlo desde Mensajes pendientes.</w:t>
             </w:r>
           </w:p>
         </w:tc>
@@ -2814,7 +2719,7 @@
         <w:pStyle w:val="Heading1"/>
       </w:pPr>
       <w:r>
-        <w:t>8. Pendientes de verificar con el propietario</w:t>
+        <w:t>8. Datos pendientes antes de cobrar reservas reales</w:t>
       </w:r>
     </w:p>
     <w:p>
@@ -2824,14 +2729,7 @@
         <w:ind w:left="540" w:hanging="271"/>
       </w:pPr>
       <w:r>
-        <w:rPr>
-          <w:rFonts w:ascii="Calibri" w:hAnsi="Calibri"/>
-          <w:b w:val="0"/>
-          <w:i w:val="0"/>
-          <w:color w:val="000000"/>
-          <w:sz w:val="22"/>
-        </w:rPr>
-        <w:t>Cuentas bancarias definitivas, titular, banco, tipo y número.</w:t>
+        <w:t>Sustituir en Configuración las cuentas bancarias marcadas como PRUEBA / NO PAGAR por las cuentas reales verificadas.</w:t>
       </w:r>
     </w:p>
     <w:p>
@@ -2841,14 +2739,7 @@
         <w:ind w:left="540" w:hanging="271"/>
       </w:pPr>
       <w:r>
-        <w:rPr>
-          <w:rFonts w:ascii="Calibri" w:hAnsi="Calibri"/>
-          <w:b w:val="0"/>
-          <w:i w:val="0"/>
-          <w:color w:val="000000"/>
-          <w:sz w:val="22"/>
-        </w:rPr>
-        <w:t>Porcentaje definitivo del anticipo y texto comercial/legal de las condiciones.</w:t>
+        <w:t>Completar la ubicación exacta y las instrucciones de acceso cuando estén disponibles; se enviarán un día antes de la llegada.</w:t>
       </w:r>
     </w:p>
     <w:p>
@@ -2858,14 +2749,7 @@
         <w:ind w:left="540" w:hanging="271"/>
       </w:pPr>
       <w:r>
-        <w:rPr>
-          <w:rFonts w:ascii="Calibri" w:hAnsi="Calibri"/>
-          <w:b w:val="0"/>
-          <w:i w:val="0"/>
-          <w:color w:val="000000"/>
-          <w:sz w:val="22"/>
-        </w:rPr>
-        <w:t>Horario real, tiempo de respuesta y canal humano para solicitudes de asistencia.</w:t>
+        <w:t>Agregar el correo de Gregorio solamente si se le creará una cuenta individual para entrar al panel.</w:t>
       </w:r>
     </w:p>
     <w:p>
@@ -2875,14 +2759,7 @@
         <w:ind w:left="540" w:hanging="271"/>
       </w:pPr>
       <w:r>
-        <w:rPr>
-          <w:rFonts w:ascii="Calibri" w:hAnsi="Calibri"/>
-          <w:b w:val="0"/>
-          <w:i w:val="0"/>
-          <w:color w:val="000000"/>
-          <w:sz w:val="22"/>
-        </w:rPr>
-        <w:t>Política de cancelación, reembolsos, modificación y vencimiento del pago.</w:t>
+        <w:t>Realizar una reserva de prueba completa con los dos administradores autorizados antes de recibir el primer pago real.</w:t>
       </w:r>
     </w:p>
     <w:p>
@@ -2892,14 +2769,7 @@
         <w:ind w:left="540" w:hanging="271"/>
       </w:pPr>
       <w:r>
-        <w:rPr>
-          <w:rFonts w:ascii="Calibri" w:hAnsi="Calibri"/>
-          <w:b w:val="0"/>
-          <w:i w:val="0"/>
-          <w:color w:val="000000"/>
-          <w:sz w:val="22"/>
-        </w:rPr>
-        <w:t>Contenido definitivo, precios, fotos y disponibilidad de las 13 cabañas.</w:t>
+        <w:t>Confirmado: las 13 cabañas cargadas corresponden a la configuración operativa actual.</w:t>
       </w:r>
     </w:p>
     <w:p>
@@ -2909,14 +2779,7 @@
         <w:ind w:left="540" w:hanging="271"/>
       </w:pPr>
       <w:r>
-        <w:rPr>
-          <w:rFonts w:ascii="Calibri" w:hAnsi="Calibri"/>
-          <w:b w:val="0"/>
-          <w:i w:val="0"/>
-          <w:color w:val="000000"/>
-          <w:sz w:val="22"/>
-        </w:rPr>
-        <w:t>Responsables autorizados para eliminar reservas, usuarios o cabañas.</w:t>
+        <w:t>La operación administrativa autorizada corresponde a Carlos Velasquez y Gregorio Gonzalez; las acciones superiores quedan restringidas al superadministrador.</w:t>
       </w:r>
     </w:p>
     <w:p>

</xml_diff>